<commit_message>
Updated Report and Readme Location
</commit_message>
<xml_diff>
--- a/DataMosiac_Group6_Report.docx
+++ b/DataMosiac_Group6_Report.docx
@@ -3,6 +3,243 @@
 <w:document xmlns:wpc="http://schemas.microsoft.com/office/word/2010/wordprocessingCanvas" xmlns:cx="http://schemas.microsoft.com/office/drawing/2014/chartex" xmlns:cx1="http://schemas.microsoft.com/office/drawing/2015/9/8/chartex" xmlns:cx2="http://schemas.microsoft.com/office/drawing/2015/10/21/chartex" xmlns:cx3="http://schemas.microsoft.com/office/drawing/2016/5/9/chartex" xmlns:cx4="http://schemas.microsoft.com/office/drawing/2016/5/10/chartex" xmlns:cx5="http://schemas.microsoft.com/office/drawing/2016/5/11/chartex" xmlns:cx6="http://schemas.microsoft.com/office/drawing/2016/5/12/chartex" xmlns:cx7="http://schemas.microsoft.com/office/drawing/2016/5/13/chartex" xmlns:cx8="http://schemas.microsoft.com/office/drawing/2016/5/14/chartex" xmlns:mc="http://schemas.openxmlformats.org/markup-compatibility/2006" xmlns:aink="http://schemas.microsoft.com/office/drawing/2016/ink" xmlns:am3d="http://schemas.microsoft.com/office/drawing/2017/model3d" xmlns:o="urn:schemas-microsoft-com:office:office" xmlns:oel="http://schemas.microsoft.com/office/2019/extlst" xmlns:r="http://schemas.openxmlformats.org/officeDocument/2006/relationships" xmlns:m="http://schemas.openxmlformats.org/officeDocument/2006/math" xmlns:v="urn:schemas-microsoft-com:vml" xmlns:wp14="http://schemas.microsoft.com/office/word/2010/wordprocessingDrawing" xmlns:wp="http://schemas.openxmlformats.org/drawingml/2006/wordprocessingDrawing" xmlns:w10="urn:schemas-microsoft-com:office:word" xmlns:w="http://schemas.openxmlformats.org/wordprocessingml/2006/main" xmlns:w14="http://schemas.microsoft.com/office/word/2010/wordml" xmlns:w15="http://schemas.microsoft.com/office/word/2012/wordml" xmlns:w16cex="http://schemas.microsoft.com/office/word/2018/wordml/cex" xmlns:w16cid="http://schemas.microsoft.com/office/word/2016/wordml/cid" xmlns:w16="http://schemas.microsoft.com/office/word/2018/wordml" xmlns:w16du="http://schemas.microsoft.com/office/word/2023/wordml/word16du" xmlns:w16sdtdh="http://schemas.microsoft.com/office/word/2020/wordml/sdtdatahash" xmlns:w16sdtfl="http://schemas.microsoft.com/office/word/2024/wordml/sdtformatlock" xmlns:w16se="http://schemas.microsoft.com/office/word/2015/wordml/symex" xmlns:wpg="http://schemas.microsoft.com/office/word/2010/wordprocessingGroup" xmlns:wpi="http://schemas.microsoft.com/office/word/2010/wordprocessingInk" xmlns:wne="http://schemas.microsoft.com/office/word/2006/wordml" xmlns:wps="http://schemas.microsoft.com/office/word/2010/wordprocessingShape" mc:Ignorable="w14 w15 w16se w16cid w16 w16cex w16sdtdh w16sdtfl w16du wp14">
   <w:body>
     <w:p/>
+    <w:p>
+      <w:r>
+        <w:rPr>
+          <w:noProof/>
+        </w:rPr>
+        <mc:AlternateContent>
+          <mc:Choice Requires="wps">
+            <w:drawing>
+              <wp:anchor distT="0" distB="0" distL="114300" distR="114300" simplePos="0" relativeHeight="251667456" behindDoc="0" locked="0" layoutInCell="1" allowOverlap="1" wp14:anchorId="664B33B3" wp14:editId="60350295">
+                <wp:simplePos x="0" y="0"/>
+                <wp:positionH relativeFrom="page">
+                  <wp:posOffset>230588</wp:posOffset>
+                </wp:positionH>
+                <wp:positionV relativeFrom="page">
+                  <wp:posOffset>7036904</wp:posOffset>
+                </wp:positionV>
+                <wp:extent cx="7315200" cy="1009650"/>
+                <wp:effectExtent l="0" t="0" r="0" b="0"/>
+                <wp:wrapSquare wrapText="bothSides"/>
+                <wp:docPr id="552281636" name="Text Box 161"/>
+                <wp:cNvGraphicFramePr/>
+                <a:graphic xmlns:a="http://schemas.openxmlformats.org/drawingml/2006/main">
+                  <a:graphicData uri="http://schemas.microsoft.com/office/word/2010/wordprocessingShape">
+                    <wps:wsp>
+                      <wps:cNvSpPr txBox="1"/>
+                      <wps:spPr>
+                        <a:xfrm>
+                          <a:off x="0" y="0"/>
+                          <a:ext cx="7315200" cy="1009650"/>
+                        </a:xfrm>
+                        <a:prstGeom prst="rect">
+                          <a:avLst/>
+                        </a:prstGeom>
+                        <a:noFill/>
+                        <a:ln w="6350">
+                          <a:noFill/>
+                        </a:ln>
+                        <a:effectLst/>
+                      </wps:spPr>
+                      <wps:style>
+                        <a:lnRef idx="0">
+                          <a:schemeClr val="accent1"/>
+                        </a:lnRef>
+                        <a:fillRef idx="0">
+                          <a:schemeClr val="accent1"/>
+                        </a:fillRef>
+                        <a:effectRef idx="0">
+                          <a:schemeClr val="accent1"/>
+                        </a:effectRef>
+                        <a:fontRef idx="minor">
+                          <a:schemeClr val="dk1"/>
+                        </a:fontRef>
+                      </wps:style>
+                      <wps:txbx>
+                        <w:txbxContent>
+                          <w:p>
+                            <w:pPr>
+                              <w:pStyle w:val="NoSpacing"/>
+                              <w:jc w:val="right"/>
+                              <w:rPr>
+                                <w:color w:val="156082" w:themeColor="accent1"/>
+                                <w:sz w:val="28"/>
+                                <w:szCs w:val="28"/>
+                              </w:rPr>
+                            </w:pPr>
+                            <w:r>
+                              <w:rPr>
+                                <w:color w:val="156082" w:themeColor="accent1"/>
+                                <w:sz w:val="28"/>
+                                <w:szCs w:val="28"/>
+                              </w:rPr>
+                              <w:t>Abstract</w:t>
+                            </w:r>
+                          </w:p>
+                          <w:sdt>
+                            <w:sdtPr>
+                              <w:rPr>
+                                <w:color w:val="595959" w:themeColor="text1" w:themeTint="A6"/>
+                                <w:sz w:val="20"/>
+                                <w:szCs w:val="20"/>
+                              </w:rPr>
+                              <w:alias w:val="Abstract"/>
+                              <w:tag w:val=""/>
+                              <w:id w:val="1837959642"/>
+                              <w:dataBinding w:prefixMappings="xmlns:ns0='http://schemas.microsoft.com/office/2006/coverPageProps' " w:xpath="/ns0:CoverPageProperties[1]/ns0:Abstract[1]" w:storeItemID="{55AF091B-3C7A-41E3-B477-F2FDAA23CFDA}"/>
+                              <w:text w:multiLine="1"/>
+                            </w:sdtPr>
+                            <w:sdtContent>
+                              <w:p>
+                                <w:pPr>
+                                  <w:pStyle w:val="NoSpacing"/>
+                                  <w:jc w:val="right"/>
+                                  <w:rPr>
+                                    <w:color w:val="595959" w:themeColor="text1" w:themeTint="A6"/>
+                                    <w:sz w:val="20"/>
+                                    <w:szCs w:val="20"/>
+                                  </w:rPr>
+                                </w:pPr>
+                                <w:r>
+                                  <w:rPr>
+                                    <w:color w:val="595959" w:themeColor="text1" w:themeTint="A6"/>
+                                    <w:sz w:val="20"/>
+                                    <w:szCs w:val="20"/>
+                                  </w:rPr>
+                                  <w:t xml:space="preserve">Crypto Currency data mosaic, sourcing data from </w:t>
+                                </w:r>
+                                <w:proofErr w:type="spellStart"/>
+                                <w:r>
+                                  <w:rPr>
+                                    <w:color w:val="595959" w:themeColor="text1" w:themeTint="A6"/>
+                                    <w:sz w:val="20"/>
+                                    <w:szCs w:val="20"/>
+                                  </w:rPr>
+                                  <w:t>well known</w:t>
+                                </w:r>
+                                <w:proofErr w:type="spellEnd"/>
+                                <w:r>
+                                  <w:rPr>
+                                    <w:color w:val="595959" w:themeColor="text1" w:themeTint="A6"/>
+                                    <w:sz w:val="20"/>
+                                    <w:szCs w:val="20"/>
+                                  </w:rPr>
+                                  <w:t xml:space="preserve"> sources. Providing insights and charts to showcase trends </w:t>
+                                </w:r>
+                              </w:p>
+                            </w:sdtContent>
+                          </w:sdt>
+                        </w:txbxContent>
+                      </wps:txbx>
+                      <wps:bodyPr rot="0" spcFirstLastPara="0" vertOverflow="overflow" horzOverflow="overflow" vert="horz" wrap="square" lIns="1600200" tIns="0" rIns="685800" bIns="0" numCol="1" spcCol="0" rtlCol="0" fromWordArt="0" anchor="t" anchorCtr="0" forceAA="0" compatLnSpc="1">
+                        <a:prstTxWarp prst="textNoShape">
+                          <a:avLst/>
+                        </a:prstTxWarp>
+                        <a:spAutoFit/>
+                      </wps:bodyPr>
+                    </wps:wsp>
+                  </a:graphicData>
+                </a:graphic>
+                <wp14:sizeRelH relativeFrom="page">
+                  <wp14:pctWidth>94100</wp14:pctWidth>
+                </wp14:sizeRelH>
+                <wp14:sizeRelV relativeFrom="page">
+                  <wp14:pctHeight>10000</wp14:pctHeight>
+                </wp14:sizeRelV>
+              </wp:anchor>
+            </w:drawing>
+          </mc:Choice>
+          <mc:Fallback>
+            <w:pict>
+              <v:shapetype w14:anchorId="664B33B3" id="_x0000_t202" coordsize="21600,21600" o:spt="202" path="m,l,21600r21600,l21600,xe">
+                <v:stroke joinstyle="miter"/>
+                <v:path gradientshapeok="t" o:connecttype="rect"/>
+              </v:shapetype>
+              <v:shape id="Text Box 161" o:spid="_x0000_s1026" type="#_x0000_t202" style="position:absolute;margin-left:18.15pt;margin-top:554.1pt;width:8in;height:79.5pt;z-index:251667456;visibility:visible;mso-wrap-style:square;mso-width-percent:941;mso-height-percent:100;mso-wrap-distance-left:9pt;mso-wrap-distance-top:0;mso-wrap-distance-right:9pt;mso-wrap-distance-bottom:0;mso-position-horizontal:absolute;mso-position-horizontal-relative:page;mso-position-vertical:absolute;mso-position-vertical-relative:page;mso-width-percent:941;mso-height-percent:100;mso-width-relative:page;mso-height-relative:page;v-text-anchor:top" o:gfxdata="UEsDBBQABgAIAAAAIQC2gziS/gAAAOEBAAATAAAAW0NvbnRlbnRfVHlwZXNdLnhtbJSRQU7DMBBF&#10;90jcwfIWJU67QAgl6YK0S0CoHGBkTxKLZGx5TGhvj5O2G0SRWNoz/78nu9wcxkFMGNg6quQqL6RA&#10;0s5Y6ir5vt9lD1JwBDIwOMJKHpHlpr69KfdHjyxSmriSfYz+USnWPY7AufNIadK6MEJMx9ApD/oD&#10;OlTrorhX2lFEilmcO2RdNtjC5xDF9pCuTyYBB5bi6bQ4syoJ3g9WQ0ymaiLzg5KdCXlKLjvcW893&#10;SUOqXwnz5DrgnHtJTxOsQfEKIT7DmDSUCaxw7Rqn8787ZsmRM9e2VmPeBN4uqYvTtW7jvijg9N/y&#10;JsXecLq0q+WD6m8AAAD//wMAUEsDBBQABgAIAAAAIQA4/SH/1gAAAJQBAAALAAAAX3JlbHMvLnJl&#10;bHOkkMFqwzAMhu+DvYPRfXGawxijTi+j0GvpHsDYimMaW0Yy2fr2M4PBMnrbUb/Q94l/f/hMi1qR&#10;JVI2sOt6UJgd+ZiDgffL8ekFlFSbvV0oo4EbChzGx4f9GRdb25HMsYhqlCwG5lrLq9biZkxWOiqY&#10;22YiTra2kYMu1l1tQD30/bPm3wwYN0x18gb45AdQl1tp5j/sFB2T0FQ7R0nTNEV3j6o9feQzro1i&#10;OWA14Fm+Q8a1a8+Bvu/d/dMb2JY5uiPbhG/ktn4cqGU/er3pcvwCAAD//wMAUEsDBBQABgAIAAAA&#10;IQCrJfneagIAADkFAAAOAAAAZHJzL2Uyb0RvYy54bWysVE1v2zAMvQ/YfxB0X+y0SNYFdYqsRYYB&#10;QVs0HXpWZKkxJouaxMTOfv0o2U66bpcOu8g0SfHj8VGXV21t2F75UIEt+HiUc6ashLKyzwX/9rj8&#10;cMFZQGFLYcCqgh9U4Ffz9+8uGzdTZ7AFUyrPKIgNs8YVfIvoZlkW5FbVIozAKUtGDb4WSL/+OSu9&#10;aCh6bbKzPJ9mDfjSeZAqBNLedEY+T/G1VhLvtA4KmSk41Ybp9OncxDObX4rZsxduW8m+DPEPVdSi&#10;spT0GOpGoGA7X/0Rqq6khwAaRxLqDLSupEo9UDfj/FU3661wKvVC4AR3hCn8v7Dydr92955h+xla&#10;GmAEpHFhFkgZ+2m1r+OXKmVkJwgPR9hUi0yS8uP5eEKz4EySbZznn6aTBGx2uu58wC8KahaFgnua&#10;S4JL7FcBKSW5Di4xm4VlZUyajbGsKfj0nEL+ZqEbxkaNSlPuw5xKTxIejIo+xj4ozaoydRAViV/q&#10;2ni2F8QMIaWymJpPcck7emkq4i0Xe/9TVW+53PUxZAaLx8t1ZcGn7l+VXX4fStadPwH5ou8oYrtp&#10;+5FuoDzQpD10SxCcXFY0jZUIeC88sZ4mSJuMd3RoA4Q69BJnW/A//6aP/kRGsnLW0BYVPPzYCa84&#10;M18t0XQ8zfNEDUy/lMEnYXoxuYiM2Qxqu6uvgSYxpufCySRGZzSDqD3UT7Tri5iQTMJKSltwHMRr&#10;7Naa3gqpFovkRDvmBK7s2skYOg4m0uyxfRLe9VxEovEtDKsmZq8o2fkmzrjFDomYia8R2w7QHnPa&#10;z0Tj/i2JD8DL/+R1evHmvwAAAP//AwBQSwMEFAAGAAgAAAAhACHWDCHiAAAADQEAAA8AAABkcnMv&#10;ZG93bnJldi54bWxMj8FOwzAQRO9I/IO1SFwq6sStQhTiVAgEEhdKCx/gxm4ciNeR7baBr2d7gtvu&#10;zGj2bb2a3MCOJsTeo4R8ngEz2HrdYyfh4/3ppgQWk0KtBo9GwreJsGouL2pVaX/CjTluU8eoBGOl&#10;JNiUxorz2FrjVJz70SB5ex+cSrSGjuugTlTuBi6yrOBO9UgXrBrNgzXt1/bgJMwe8SXlP5/r59n+&#10;VbyFZVraTZLy+mq6vwOWzJT+wnDGJ3RoiGnnD6gjGyQsigUlSc+zUgA7J/KyJG1HkyhuBfCm5v+/&#10;aH4BAAD//wMAUEsBAi0AFAAGAAgAAAAhALaDOJL+AAAA4QEAABMAAAAAAAAAAAAAAAAAAAAAAFtD&#10;b250ZW50X1R5cGVzXS54bWxQSwECLQAUAAYACAAAACEAOP0h/9YAAACUAQAACwAAAAAAAAAAAAAA&#10;AAAvAQAAX3JlbHMvLnJlbHNQSwECLQAUAAYACAAAACEAqyX53moCAAA5BQAADgAAAAAAAAAAAAAA&#10;AAAuAgAAZHJzL2Uyb0RvYy54bWxQSwECLQAUAAYACAAAACEAIdYMIeIAAAANAQAADwAAAAAAAAAA&#10;AAAAAADEBAAAZHJzL2Rvd25yZXYueG1sUEsFBgAAAAAEAAQA8wAAANMFAAAAAA==&#10;" filled="f" stroked="f" strokeweight=".5pt">
+                <v:textbox style="mso-fit-shape-to-text:t" inset="126pt,0,54pt,0">
+                  <w:txbxContent>
+                    <w:p>
+                      <w:pPr>
+                        <w:pStyle w:val="NoSpacing"/>
+                        <w:jc w:val="right"/>
+                        <w:rPr>
+                          <w:color w:val="156082" w:themeColor="accent1"/>
+                          <w:sz w:val="28"/>
+                          <w:szCs w:val="28"/>
+                        </w:rPr>
+                      </w:pPr>
+                      <w:r>
+                        <w:rPr>
+                          <w:color w:val="156082" w:themeColor="accent1"/>
+                          <w:sz w:val="28"/>
+                          <w:szCs w:val="28"/>
+                        </w:rPr>
+                        <w:t>Abstract</w:t>
+                      </w:r>
+                    </w:p>
+                    <w:sdt>
+                      <w:sdtPr>
+                        <w:rPr>
+                          <w:color w:val="595959" w:themeColor="text1" w:themeTint="A6"/>
+                          <w:sz w:val="20"/>
+                          <w:szCs w:val="20"/>
+                        </w:rPr>
+                        <w:alias w:val="Abstract"/>
+                        <w:tag w:val=""/>
+                        <w:id w:val="1837959642"/>
+                        <w:dataBinding w:prefixMappings="xmlns:ns0='http://schemas.microsoft.com/office/2006/coverPageProps' " w:xpath="/ns0:CoverPageProperties[1]/ns0:Abstract[1]" w:storeItemID="{55AF091B-3C7A-41E3-B477-F2FDAA23CFDA}"/>
+                        <w:text w:multiLine="1"/>
+                      </w:sdtPr>
+                      <w:sdtContent>
+                        <w:p>
+                          <w:pPr>
+                            <w:pStyle w:val="NoSpacing"/>
+                            <w:jc w:val="right"/>
+                            <w:rPr>
+                              <w:color w:val="595959" w:themeColor="text1" w:themeTint="A6"/>
+                              <w:sz w:val="20"/>
+                              <w:szCs w:val="20"/>
+                            </w:rPr>
+                          </w:pPr>
+                          <w:r>
+                            <w:rPr>
+                              <w:color w:val="595959" w:themeColor="text1" w:themeTint="A6"/>
+                              <w:sz w:val="20"/>
+                              <w:szCs w:val="20"/>
+                            </w:rPr>
+                            <w:t xml:space="preserve">Crypto Currency data mosaic, sourcing data from </w:t>
+                          </w:r>
+                          <w:proofErr w:type="spellStart"/>
+                          <w:r>
+                            <w:rPr>
+                              <w:color w:val="595959" w:themeColor="text1" w:themeTint="A6"/>
+                              <w:sz w:val="20"/>
+                              <w:szCs w:val="20"/>
+                            </w:rPr>
+                            <w:t>well known</w:t>
+                          </w:r>
+                          <w:proofErr w:type="spellEnd"/>
+                          <w:r>
+                            <w:rPr>
+                              <w:color w:val="595959" w:themeColor="text1" w:themeTint="A6"/>
+                              <w:sz w:val="20"/>
+                              <w:szCs w:val="20"/>
+                            </w:rPr>
+                            <w:t xml:space="preserve"> sources. Providing insights and charts to showcase trends </w:t>
+                          </w:r>
+                        </w:p>
+                      </w:sdtContent>
+                    </w:sdt>
+                  </w:txbxContent>
+                </v:textbox>
+                <w10:wrap type="square" anchorx="page" anchory="page"/>
+              </v:shape>
+            </w:pict>
+          </mc:Fallback>
+        </mc:AlternateContent>
+      </w:r>
+    </w:p>
     <w:sdt>
       <w:sdtPr>
         <w:id w:val="-1715494890"/>
@@ -362,11 +599,7 @@
               </mc:Choice>
               <mc:Fallback>
                 <w:pict>
-                  <v:shapetype w14:anchorId="55F66AC1" id="_x0000_t202" coordsize="21600,21600" o:spt="202" path="m,l,21600r21600,l21600,xe">
-                    <v:stroke joinstyle="miter"/>
-                    <v:path gradientshapeok="t" o:connecttype="rect"/>
-                  </v:shapetype>
-                  <v:shape id="Text Box 159" o:spid="_x0000_s1026" type="#_x0000_t202" style="position:absolute;margin-left:0;margin-top:0;width:8in;height:1in;z-index:251659264;visibility:visible;mso-wrap-style:square;mso-width-percent:941;mso-height-percent:92;mso-top-percent:818;mso-wrap-distance-left:9pt;mso-wrap-distance-top:0;mso-wrap-distance-right:9pt;mso-wrap-distance-bottom:0;mso-position-horizontal:center;mso-position-horizontal-relative:page;mso-position-vertical-relative:page;mso-width-percent:941;mso-height-percent:92;mso-top-percent:818;mso-width-relative:page;mso-height-relative:page;v-text-anchor:bottom" o:gfxdata="UEsDBBQABgAIAAAAIQC2gziS/gAAAOEBAAATAAAAW0NvbnRlbnRfVHlwZXNdLnhtbJSRQU7DMBBF&#10;90jcwfIWJU67QAgl6YK0S0CoHGBkTxKLZGx5TGhvj5O2G0SRWNoz/78nu9wcxkFMGNg6quQqL6RA&#10;0s5Y6ir5vt9lD1JwBDIwOMJKHpHlpr69KfdHjyxSmriSfYz+USnWPY7AufNIadK6MEJMx9ApD/oD&#10;OlTrorhX2lFEilmcO2RdNtjC5xDF9pCuTyYBB5bi6bQ4syoJ3g9WQ0ymaiLzg5KdCXlKLjvcW893&#10;SUOqXwnz5DrgnHtJTxOsQfEKIT7DmDSUCaxw7Rqn8787ZsmRM9e2VmPeBN4uqYvTtW7jvijg9N/y&#10;JsXecLq0q+WD6m8AAAD//wMAUEsDBBQABgAIAAAAIQA4/SH/1gAAAJQBAAALAAAAX3JlbHMvLnJl&#10;bHOkkMFqwzAMhu+DvYPRfXGawxijTi+j0GvpHsDYimMaW0Yy2fr2M4PBMnrbUb/Q94l/f/hMi1qR&#10;JVI2sOt6UJgd+ZiDgffL8ekFlFSbvV0oo4EbChzGx4f9GRdb25HMsYhqlCwG5lrLq9biZkxWOiqY&#10;22YiTra2kYMu1l1tQD30/bPm3wwYN0x18gb45AdQl1tp5j/sFB2T0FQ7R0nTNEV3j6o9feQzro1i&#10;OWA14Fm+Q8a1a8+Bvu/d/dMb2JY5uiPbhG/ktn4cqGU/er3pcvwCAAD//wMAUEsDBBQABgAIAAAA&#10;IQDOECLcaQIAADgFAAAOAAAAZHJzL2Uyb0RvYy54bWysVN9v0zAQfkfif7D8zpJuaynV0qlsKkKa&#10;tokO7dl17DXC8Rn72qT89ZydpJ0KL0O8OBffd7+/89V1Wxu2Uz5UYAs+Oss5U1ZCWdmXgn9/Wn6Y&#10;chZQ2FIYsKrgexX49fz9u6vGzdQ5bMCUyjNyYsOscQXfILpZlgW5UbUIZ+CUJaUGXwukX/+SlV40&#10;5L022XmeT7IGfOk8SBUC3d52Sj5P/rVWEh+0DgqZKTjlhun06VzHM5tfidmLF25TyT4N8Q9Z1KKy&#10;FPTg6lagYFtf/eGqrqSHABrPJNQZaF1JlWqgakb5STWrjXAq1ULNCe7QpvD/3Mr73co9eobtZ2hp&#10;gLEhjQuzQJexnlb7On4pU0Z6auH+0DbVIpN0+fFiNKZZcCZJ92l0eUkyucmO1s4H/KKgZlEouKex&#10;pG6J3V3ADjpAYjALy8qYNBpjWVPwycU4TwYHDTk3NmJVGnLv5ph5knBvVMQY+01pVpWpgHiR6KVu&#10;jGc7QcQQUiqLqfbkl9ARpSmJtxj2+GNWbzHu6hgig8WDcV1Z8Kn6k7TLH0PKusNTz1/VHUVs120/&#10;0TWUexq0h24HgpPLiqZxJwI+Ck+kpwHSIuMDHdoAdR16ibMN+F9/u4944iJpOWtoiQoefm6FV5yZ&#10;r5ZYOprkeWIGpl+K4JMwmY6nkTDr4dpu6xugSYzotXAyiRGMZhC1h/qZVn0RA5JKWElhC74exBvs&#10;tpqeCqkWiwSiFXMC7+zKyeg6DibS7Kl9Ft71XERi8T0MmyZmJ5TssNHSwmKLoKvE19jbrqF9z2k9&#10;E+P7pyTu/+v/hDo+ePPfAAAA//8DAFBLAwQUAAYACAAAACEA7ApflN0AAAAGAQAADwAAAGRycy9k&#10;b3ducmV2LnhtbEyPQUvDQBCF70L/wzKCF7G7LamUmE0pVUHBS1tBj5vsmASzsyG7aVN/vVMv9TLM&#10;4w1vvpetRteKA/ah8aRhNlUgkEpvG6o0vO+f75YgQjRkTesJNZwwwCqfXGUmtf5IWzzsYiU4hEJq&#10;NNQxdqmUoazRmTD1HRJ7X753JrLsK2l7c+Rw18q5UvfSmYb4Q2063NRYfu8Gp+HxVS1P++Tn9q37&#10;3BQf6kmql0FqfXM9rh9ARBzj5RjO+IwOOTMVfiAbRKuBi8S/efZmiznrgrckUSDzTP7Hz38BAAD/&#10;/wMAUEsBAi0AFAAGAAgAAAAhALaDOJL+AAAA4QEAABMAAAAAAAAAAAAAAAAAAAAAAFtDb250ZW50&#10;X1R5cGVzXS54bWxQSwECLQAUAAYACAAAACEAOP0h/9YAAACUAQAACwAAAAAAAAAAAAAAAAAvAQAA&#10;X3JlbHMvLnJlbHNQSwECLQAUAAYACAAAACEAzhAi3GkCAAA4BQAADgAAAAAAAAAAAAAAAAAuAgAA&#10;ZHJzL2Uyb0RvYy54bWxQSwECLQAUAAYACAAAACEA7ApflN0AAAAGAQAADwAAAAAAAAAAAAAAAADD&#10;BAAAZHJzL2Rvd25yZXYueG1sUEsFBgAAAAAEAAQA8wAAAM0FAAAAAA==&#10;" filled="f" stroked="f" strokeweight=".5pt">
+                  <v:shape w14:anchorId="55F66AC1" id="Text Box 159" o:spid="_x0000_s1027" type="#_x0000_t202" style="position:absolute;margin-left:0;margin-top:0;width:8in;height:1in;z-index:251659264;visibility:visible;mso-wrap-style:square;mso-width-percent:941;mso-height-percent:92;mso-top-percent:818;mso-wrap-distance-left:9pt;mso-wrap-distance-top:0;mso-wrap-distance-right:9pt;mso-wrap-distance-bottom:0;mso-position-horizontal:center;mso-position-horizontal-relative:page;mso-position-vertical-relative:page;mso-width-percent:941;mso-height-percent:92;mso-top-percent:818;mso-width-relative:page;mso-height-relative:page;v-text-anchor:bottom" o:gfxdata="UEsDBBQABgAIAAAAIQC2gziS/gAAAOEBAAATAAAAW0NvbnRlbnRfVHlwZXNdLnhtbJSRQU7DMBBF&#10;90jcwfIWJU67QAgl6YK0S0CoHGBkTxKLZGx5TGhvj5O2G0SRWNoz/78nu9wcxkFMGNg6quQqL6RA&#10;0s5Y6ir5vt9lD1JwBDIwOMJKHpHlpr69KfdHjyxSmriSfYz+USnWPY7AufNIadK6MEJMx9ApD/oD&#10;OlTrorhX2lFEilmcO2RdNtjC5xDF9pCuTyYBB5bi6bQ4syoJ3g9WQ0ymaiLzg5KdCXlKLjvcW893&#10;SUOqXwnz5DrgnHtJTxOsQfEKIT7DmDSUCaxw7Rqn8787ZsmRM9e2VmPeBN4uqYvTtW7jvijg9N/y&#10;JsXecLq0q+WD6m8AAAD//wMAUEsDBBQABgAIAAAAIQA4/SH/1gAAAJQBAAALAAAAX3JlbHMvLnJl&#10;bHOkkMFqwzAMhu+DvYPRfXGawxijTi+j0GvpHsDYimMaW0Yy2fr2M4PBMnrbUb/Q94l/f/hMi1qR&#10;JVI2sOt6UJgd+ZiDgffL8ekFlFSbvV0oo4EbChzGx4f9GRdb25HMsYhqlCwG5lrLq9biZkxWOiqY&#10;22YiTra2kYMu1l1tQD30/bPm3wwYN0x18gb45AdQl1tp5j/sFB2T0FQ7R0nTNEV3j6o9feQzro1i&#10;OWA14Fm+Q8a1a8+Bvu/d/dMb2JY5uiPbhG/ktn4cqGU/er3pcvwCAAD//wMAUEsDBBQABgAIAAAA&#10;IQD+aS/rawIAAD8FAAAOAAAAZHJzL2Uyb0RvYy54bWysVN9P2zAQfp+0/8Hy+0gKtOsiUtSBmCZV&#10;gAYTz65j02iOz7OvTbq/fmcnaRHbC9NenIvvu9/f+eKyawzbKR9qsCWfnOScKSuhqu1zyb8/3nyY&#10;cxZQ2EoYsKrkexX45eL9u4vWFeoUNmAq5Rk5saFoXck3iK7IsiA3qhHhBJyypNTgG4H065+zyouW&#10;vDcmO83zWdaCr5wHqUKg2+teyRfJv9ZK4p3WQSEzJafcMJ0+net4ZosLUTx74Ta1HNIQ/5BFI2pL&#10;QQ+urgUKtvX1H66aWnoIoPFEQpOB1rVUqQaqZpK/quZhI5xKtVBzgju0Kfw/t/J29+DuPcPuM3Q0&#10;wNiQ1oUi0GWsp9O+iV/KlJGeWrg/tE11yCRdfjybTGkWnEnSfZqcn5NMbrKjtfMBvyhoWBRK7mks&#10;qVtitwrYQ0dIDGbhpjYmjcZY1pZ8djbNk8FBQ86NjViVhjy4OWaeJNwbFTHGflOa1VUqIF4keqkr&#10;49lOEDGElMpiqj35JXREaUriLYYD/pjVW4z7OsbIYPFg3NQWfKr+VdrVjzFl3eOp5y/qjiJ2644K&#10;fzHYNVR7mreHfhWCkzc1DWUlAt4LT9ynOdI+4x0d2gA1HwaJsw34X3+7j3iiJGk5a2mXSh5+boVX&#10;nJmvlsg6meV5IgimX4rgkzCbT+eRN+vx2m6bK6CBTOjRcDKJEYxmFLWH5ok2fhkDkkpYSWFLvh7F&#10;K+yXm14MqZbLBKJNcwJX9sHJ6DrOJ7LtsXsS3g2URCLzLYwLJ4pXzOyx0dLCcoug60Tb2OK+oUPr&#10;aUsT8YcXJT4DL/8T6vjuLX4DAAD//wMAUEsDBBQABgAIAAAAIQDsCl+U3QAAAAYBAAAPAAAAZHJz&#10;L2Rvd25yZXYueG1sTI9BS8NAEIXvQv/DMoIXsbstqZSYTSlVQcFLW0GPm+yYBLOzIbtpU3+9Uy/1&#10;MszjDW++l61G14oD9qHxpGE2VSCQSm8bqjS875/vliBCNGRN6wk1nDDAKp9cZSa1/khbPOxiJTiE&#10;Qmo01DF2qZShrNGZMPUdEntfvncmsuwraXtz5HDXyrlS99KZhvhDbTrc1Fh+7wan4fFVLU/75Of2&#10;rfvcFB/qSaqXQWp9cz2uH0BEHOPlGM74jA45MxV+IBtEq4GLxL959maLOeuCtyRRIPNM/sfPfwEA&#10;AP//AwBQSwECLQAUAAYACAAAACEAtoM4kv4AAADhAQAAEwAAAAAAAAAAAAAAAAAAAAAAW0NvbnRl&#10;bnRfVHlwZXNdLnhtbFBLAQItABQABgAIAAAAIQA4/SH/1gAAAJQBAAALAAAAAAAAAAAAAAAAAC8B&#10;AABfcmVscy8ucmVsc1BLAQItABQABgAIAAAAIQD+aS/rawIAAD8FAAAOAAAAAAAAAAAAAAAAAC4C&#10;AABkcnMvZTJvRG9jLnhtbFBLAQItABQABgAIAAAAIQDsCl+U3QAAAAYBAAAPAAAAAAAAAAAAAAAA&#10;AMUEAABkcnMvZG93bnJldi54bWxQSwUGAAAAAAQABADzAAAAzwUAAAAA&#10;" filled="f" stroked="f" strokeweight=".5pt">
                     <v:textbox inset="126pt,0,54pt,0">
                       <w:txbxContent>
                         <w:p>
@@ -403,7 +636,7 @@
             <mc:AlternateContent>
               <mc:Choice Requires="wps">
                 <w:drawing>
-                  <wp:anchor distT="0" distB="0" distL="114300" distR="114300" simplePos="0" relativeHeight="251660288" behindDoc="0" locked="0" layoutInCell="1" allowOverlap="1" wp14:anchorId="2DD2C7C1" wp14:editId="2E55E8F4">
+                  <wp:anchor distT="0" distB="0" distL="114300" distR="114300" simplePos="0" relativeHeight="251660288" behindDoc="0" locked="0" layoutInCell="1" allowOverlap="1" wp14:anchorId="2DD2C7C1" wp14:editId="22DA3E38">
                     <wp:simplePos x="0" y="0"/>
                     <wp:positionH relativeFrom="page">
                       <wp:align>center</wp:align>
@@ -553,7 +786,7 @@
               </mc:Choice>
               <mc:Fallback>
                 <w:pict>
-                  <v:shape w14:anchorId="2DD2C7C1" id="Text Box 161" o:spid="_x0000_s1027" type="#_x0000_t202" style="position:absolute;margin-left:0;margin-top:0;width:8in;height:79.5pt;z-index:251660288;visibility:visible;mso-wrap-style:square;mso-width-percent:941;mso-height-percent:100;mso-top-percent:700;mso-wrap-distance-left:9pt;mso-wrap-distance-top:0;mso-wrap-distance-right:9pt;mso-wrap-distance-bottom:0;mso-position-horizontal:center;mso-position-horizontal-relative:page;mso-position-vertical-relative:page;mso-width-percent:941;mso-height-percent:100;mso-top-percent:700;mso-width-relative:page;mso-height-relative:page;v-text-anchor:top" o:gfxdata="UEsDBBQABgAIAAAAIQC2gziS/gAAAOEBAAATAAAAW0NvbnRlbnRfVHlwZXNdLnhtbJSRQU7DMBBF&#10;90jcwfIWJU67QAgl6YK0S0CoHGBkTxKLZGx5TGhvj5O2G0SRWNoz/78nu9wcxkFMGNg6quQqL6RA&#10;0s5Y6ir5vt9lD1JwBDIwOMJKHpHlpr69KfdHjyxSmriSfYz+USnWPY7AufNIadK6MEJMx9ApD/oD&#10;OlTrorhX2lFEilmcO2RdNtjC5xDF9pCuTyYBB5bi6bQ4syoJ3g9WQ0ymaiLzg5KdCXlKLjvcW893&#10;SUOqXwnz5DrgnHtJTxOsQfEKIT7DmDSUCaxw7Rqn8787ZsmRM9e2VmPeBN4uqYvTtW7jvijg9N/y&#10;JsXecLq0q+WD6m8AAAD//wMAUEsDBBQABgAIAAAAIQA4/SH/1gAAAJQBAAALAAAAX3JlbHMvLnJl&#10;bHOkkMFqwzAMhu+DvYPRfXGawxijTi+j0GvpHsDYimMaW0Yy2fr2M4PBMnrbUb/Q94l/f/hMi1qR&#10;JVI2sOt6UJgd+ZiDgffL8ekFlFSbvV0oo4EbChzGx4f9GRdb25HMsYhqlCwG5lrLq9biZkxWOiqY&#10;22YiTra2kYMu1l1tQD30/bPm3wwYN0x18gb45AdQl1tp5j/sFB2T0FQ7R0nTNEV3j6o9feQzro1i&#10;OWA14Fm+Q8a1a8+Bvu/d/dMb2JY5uiPbhG/ktn4cqGU/er3pcvwCAAD//wMAUEsDBBQABgAIAAAA&#10;IQBW4W5qbAIAAEAFAAAOAAAAZHJzL2Uyb0RvYy54bWysVE1v2zAMvQ/YfxB0X+20SJYFdYosRYcB&#10;QVu0HXpWZKkxJouaxMTOfv0o2U6ybpcOu8g0SfHj8VGXV21t2E75UIEt+Ogs50xZCWVlXwr+7enm&#10;w5SzgMKWwoBVBd+rwK/m799dNm6mzmEDplSeURAbZo0r+AbRzbIsyI2qRTgDpywZNfhaIP36l6z0&#10;oqHotcnO83ySNeBL50GqEEh73Rn5PMXXWkm80zooZKbgVBum06dzHc9sfilmL164TSX7MsQ/VFGL&#10;ylLSQ6hrgYJtffVHqLqSHgJoPJNQZ6B1JVXqgboZ5a+6edwIp1IvBE5wB5jC/wsrb3eP7t4zbD9D&#10;SwOMgDQuzAIpYz+t9nX8UqWM7ATh/gCbapFJUn68GI1pFpxJso3y/NNknIDNjtedD/hFQc2iUHBP&#10;c0lwid0qIKUk18ElZrNwUxmTZmMsawo+uaCQv1nohrFRo9KU+zDH0pOEe6Oij7EPSrOqTB1EReKX&#10;WhrPdoKYIaRUFlPzKS55Ry9NRbzlYu9/rOotl7s+hsxg8XC5riz41P2rssvvQ8m68ycgT/qOIrbr&#10;lho/mewayj0N3EO3C8HJm4qGshIB74Un8tMgaaHxjg5tgMCHXuJsA/7n3/TRnzhJVs4aWqaChx9b&#10;4RVn5qslto4meZ4YgumXMvgkTKbjaSTOelDbbb0EGsiIXg0nkxid0Qyi9lA/08ovYkIyCSspbcFx&#10;EJfYbTc9GVItFsmJVs0JXNlHJ2PoOJ/Itqf2WXjXUxKJzbcwbJyYvWJm55uo4xZbJH4m2kaIO0B7&#10;6GlNE5v7JyW+A6f/yev48M1/AQAA//8DAFBLAwQUAAYACAAAACEAxkRDDNsAAAAGAQAADwAAAGRy&#10;cy9kb3ducmV2LnhtbEyPQUvDQBCF74L/YRnBm900EmtjNkUKQlV6sPYHTLNjEszOhuymTf+9Uy96&#10;GebxhjffK1aT69SRhtB6NjCfJaCIK29brg3sP1/uHkGFiGyx80wGzhRgVV5fFZhbf+IPOu5irSSE&#10;Q44Gmhj7XOtQNeQwzHxPLN6XHxxGkUOt7YAnCXedTpPkQTtsWT402NO6oep7NzoD436z6d/Ss3+v&#10;X7eLNlvzYlzeG3N7Mz0/gYo0xb9juOALOpTCdPAj26A6A1Ik/s6LN89S0QfZsmUCuiz0f/zyBwAA&#10;//8DAFBLAQItABQABgAIAAAAIQC2gziS/gAAAOEBAAATAAAAAAAAAAAAAAAAAAAAAABbQ29udGVu&#10;dF9UeXBlc10ueG1sUEsBAi0AFAAGAAgAAAAhADj9If/WAAAAlAEAAAsAAAAAAAAAAAAAAAAALwEA&#10;AF9yZWxzLy5yZWxzUEsBAi0AFAAGAAgAAAAhAFbhbmpsAgAAQAUAAA4AAAAAAAAAAAAAAAAALgIA&#10;AGRycy9lMm9Eb2MueG1sUEsBAi0AFAAGAAgAAAAhAMZEQwzbAAAABgEAAA8AAAAAAAAAAAAAAAAA&#10;xgQAAGRycy9kb3ducmV2LnhtbFBLBQYAAAAABAAEAPMAAADOBQAAAAA=&#10;" filled="f" stroked="f" strokeweight=".5pt">
+                  <v:shape w14:anchorId="2DD2C7C1" id="_x0000_s1028" type="#_x0000_t202" style="position:absolute;margin-left:0;margin-top:0;width:8in;height:79.5pt;z-index:251660288;visibility:visible;mso-wrap-style:square;mso-width-percent:941;mso-height-percent:100;mso-top-percent:700;mso-wrap-distance-left:9pt;mso-wrap-distance-top:0;mso-wrap-distance-right:9pt;mso-wrap-distance-bottom:0;mso-position-horizontal:center;mso-position-horizontal-relative:page;mso-position-vertical-relative:page;mso-width-percent:941;mso-height-percent:100;mso-top-percent:700;mso-width-relative:page;mso-height-relative:page;v-text-anchor:top" o:gfxdata="UEsDBBQABgAIAAAAIQC2gziS/gAAAOEBAAATAAAAW0NvbnRlbnRfVHlwZXNdLnhtbJSRQU7DMBBF&#10;90jcwfIWJU67QAgl6YK0S0CoHGBkTxKLZGx5TGhvj5O2G0SRWNoz/78nu9wcxkFMGNg6quQqL6RA&#10;0s5Y6ir5vt9lD1JwBDIwOMJKHpHlpr69KfdHjyxSmriSfYz+USnWPY7AufNIadK6MEJMx9ApD/oD&#10;OlTrorhX2lFEilmcO2RdNtjC5xDF9pCuTyYBB5bi6bQ4syoJ3g9WQ0ymaiLzg5KdCXlKLjvcW893&#10;SUOqXwnz5DrgnHtJTxOsQfEKIT7DmDSUCaxw7Rqn8787ZsmRM9e2VmPeBN4uqYvTtW7jvijg9N/y&#10;JsXecLq0q+WD6m8AAAD//wMAUEsDBBQABgAIAAAAIQA4/SH/1gAAAJQBAAALAAAAX3JlbHMvLnJl&#10;bHOkkMFqwzAMhu+DvYPRfXGawxijTi+j0GvpHsDYimMaW0Yy2fr2M4PBMnrbUb/Q94l/f/hMi1qR&#10;JVI2sOt6UJgd+ZiDgffL8ekFlFSbvV0oo4EbChzGx4f9GRdb25HMsYhqlCwG5lrLq9biZkxWOiqY&#10;22YiTra2kYMu1l1tQD30/bPm3wwYN0x18gb45AdQl1tp5j/sFB2T0FQ7R0nTNEV3j6o9feQzro1i&#10;OWA14Fm+Q8a1a8+Bvu/d/dMb2JY5uiPbhG/ktn4cqGU/er3pcvwCAAD//wMAUEsDBBQABgAIAAAA&#10;IQCpK78EbgIAAEAFAAAOAAAAZHJzL2Uyb0RvYy54bWysVE1v2zAMvQ/YfxB0X+2kaJYFdYqsRYcB&#10;QVs0HXpWZKkxJouaxMTOfv0o2U66bJcOu8g0SfHj8VGXV21t2E75UIEt+Ogs50xZCWVlXwr+7en2&#10;w5SzgMKWwoBVBd+rwK/m799dNm6mxrABUyrPKIgNs8YVfIPoZlkW5EbVIpyBU5aMGnwtkH79S1Z6&#10;0VD02mTjPJ9kDfjSeZAqBNLedEY+T/G1VhLvtQ4KmSk41Ybp9OlcxzObX4rZixduU8m+DPEPVdSi&#10;spT0EOpGoGBbX/0Rqq6khwAazyTUGWhdSZV6oG5G+Uk3q41wKvVC4AR3gCn8v7DybrdyD55h+xla&#10;GmAEpHFhFkgZ+2m1r+OXKmVkJwj3B9hUi0yS8uP56IJmwZkk2yjPP00uErDZ8brzAb8oqFkUCu5p&#10;LgkusVsGpJTkOrjEbBZuK2PSbIxlTcEn5xTyNwvdMDZqVJpyH+ZYepJwb1T0MfZRaVaVqYOoSPxS&#10;18aznSBmCCmVxdR8ikve0UtTEW+52Psfq3rL5a6PITNYPFyuKws+dX9Sdvl9KFl3/gTkq76jiO26&#10;pcYLPh4mu4ZyTwP30O1CcPK2oqEsRcAH4Yn8NEhaaLynQxsg8KGXONuA//k3ffQnTpKVs4aWqeDh&#10;x1Z4xZn5aomto0meJ4Zg+qUMPgmT6cU0Emc9qO22vgYayIheDSeTGJ3RDKL2UD/Tyi9iQjIJKylt&#10;wXEQr7HbbnoypFoskhOtmhO4tCsnY+g4n8i2p/ZZeNdTEonNdzBsnJidMLPzTdRxiy0SPxNtI8Qd&#10;oD30tKaJzf2TEt+B1//J6/jwzX8BAAD//wMAUEsDBBQABgAIAAAAIQDGREMM2wAAAAYBAAAPAAAA&#10;ZHJzL2Rvd25yZXYueG1sTI9BS8NAEIXvgv9hGcGb3TQSa2M2RQpCVXqw9gdMs2MSzM6G7KZN/71T&#10;L3oZ5vGGN98rVpPr1JGG0Ho2MJ8loIgrb1uuDew/X+4eQYWIbLHzTAbOFGBVXl8VmFt/4g867mKt&#10;JIRDjgaaGPtc61A15DDMfE8s3pcfHEaRQ63tgCcJd51Ok+RBO2xZPjTY07qh6ns3OgPjfrPp39Kz&#10;f69ft4s2W/NiXN4bc3szPT+BijTFv2O44As6lMJ08CPboDoDUiT+zos3z1LRB9myZQK6LPR//PIH&#10;AAD//wMAUEsBAi0AFAAGAAgAAAAhALaDOJL+AAAA4QEAABMAAAAAAAAAAAAAAAAAAAAAAFtDb250&#10;ZW50X1R5cGVzXS54bWxQSwECLQAUAAYACAAAACEAOP0h/9YAAACUAQAACwAAAAAAAAAAAAAAAAAv&#10;AQAAX3JlbHMvLnJlbHNQSwECLQAUAAYACAAAACEAqSu/BG4CAABABQAADgAAAAAAAAAAAAAAAAAu&#10;AgAAZHJzL2Uyb0RvYy54bWxQSwECLQAUAAYACAAAACEAxkRDDNsAAAAGAQAADwAAAAAAAAAAAAAA&#10;AADIBAAAZHJzL2Rvd25yZXYueG1sUEsFBgAAAAAEAAQA8wAAANAFAAAAAA==&#10;" filled="f" stroked="f" strokeweight=".5pt">
                     <v:textbox style="mso-fit-shape-to-text:t" inset="126pt,0,54pt,0">
                       <w:txbxContent>
                         <w:p>
@@ -643,7 +876,7 @@
             <mc:AlternateContent>
               <mc:Choice Requires="wps">
                 <w:drawing>
-                  <wp:anchor distT="0" distB="0" distL="114300" distR="114300" simplePos="0" relativeHeight="251658240" behindDoc="0" locked="0" layoutInCell="1" allowOverlap="1" wp14:anchorId="3964BC16" wp14:editId="36C8AEAC">
+                  <wp:anchor distT="0" distB="0" distL="114300" distR="114300" simplePos="0" relativeHeight="251658240" behindDoc="0" locked="0" layoutInCell="1" allowOverlap="1" wp14:anchorId="3964BC16" wp14:editId="703801C2">
                     <wp:simplePos x="0" y="0"/>
                     <wp:positionH relativeFrom="page">
                       <wp:align>center</wp:align>
@@ -797,7 +1030,7 @@
               </mc:Choice>
               <mc:Fallback>
                 <w:pict>
-                  <v:shape w14:anchorId="3964BC16" id="Text Box 163" o:spid="_x0000_s1028" type="#_x0000_t202" style="position:absolute;margin-left:0;margin-top:0;width:8in;height:286.5pt;z-index:251658240;visibility:visible;mso-wrap-style:square;mso-width-percent:941;mso-height-percent:363;mso-top-percent:300;mso-wrap-distance-left:9pt;mso-wrap-distance-top:0;mso-wrap-distance-right:9pt;mso-wrap-distance-bottom:0;mso-position-horizontal:center;mso-position-horizontal-relative:page;mso-position-vertical-relative:page;mso-width-percent:941;mso-height-percent:363;mso-top-percent:300;mso-width-relative:page;mso-height-relative:page;v-text-anchor:bottom" o:gfxdata="UEsDBBQABgAIAAAAIQC2gziS/gAAAOEBAAATAAAAW0NvbnRlbnRfVHlwZXNdLnhtbJSRQU7DMBBF&#10;90jcwfIWJU67QAgl6YK0S0CoHGBkTxKLZGx5TGhvj5O2G0SRWNoz/78nu9wcxkFMGNg6quQqL6RA&#10;0s5Y6ir5vt9lD1JwBDIwOMJKHpHlpr69KfdHjyxSmriSfYz+USnWPY7AufNIadK6MEJMx9ApD/oD&#10;OlTrorhX2lFEilmcO2RdNtjC5xDF9pCuTyYBB5bi6bQ4syoJ3g9WQ0ymaiLzg5KdCXlKLjvcW893&#10;SUOqXwnz5DrgnHtJTxOsQfEKIT7DmDSUCaxw7Rqn8787ZsmRM9e2VmPeBN4uqYvTtW7jvijg9N/y&#10;JsXecLq0q+WD6m8AAAD//wMAUEsDBBQABgAIAAAAIQA4/SH/1gAAAJQBAAALAAAAX3JlbHMvLnJl&#10;bHOkkMFqwzAMhu+DvYPRfXGawxijTi+j0GvpHsDYimMaW0Yy2fr2M4PBMnrbUb/Q94l/f/hMi1qR&#10;JVI2sOt6UJgd+ZiDgffL8ekFlFSbvV0oo4EbChzGx4f9GRdb25HMsYhqlCwG5lrLq9biZkxWOiqY&#10;22YiTra2kYMu1l1tQD30/bPm3wwYN0x18gb45AdQl1tp5j/sFB2T0FQ7R0nTNEV3j6o9feQzro1i&#10;OWA14Fm+Q8a1a8+Bvu/d/dMb2JY5uiPbhG/ktn4cqGU/er3pcvwCAAD//wMAUEsDBBQABgAIAAAA&#10;IQD6sExWbQIAAEAFAAAOAAAAZHJzL2Uyb0RvYy54bWysVN9v2jAQfp+0/8Hy+wgUwRAiVKxVp0mo&#10;rUanPhvHLtEcn2cfJOyv39lJoGN76bQX53L3+X5+58V1Uxl2UD6UYHM+Ggw5U1ZCUdqXnH97uvsw&#10;4yygsIUwYFXOjyrw6+X7d4vazdUV7MAUyjNyYsO8djnfIbp5lgW5U5UIA3DKklGDrwTSr3/JCi9q&#10;8l6Z7Go4nGY1+MJ5kCoE0t62Rr5M/rVWEh+0DgqZyTnlhun06dzGM1suxPzFC7crZZeG+IcsKlFa&#10;CnpydStQsL0v/3BVldJDAI0DCVUGWpdSpRqomtHwoprNTjiVaqHmBHdqU/h/buX9YeMePcPmEzQ0&#10;wNiQ2oV5IGWsp9G+il/KlJGdWng8tU01yCQpP45HE5oFZ5Js4+l4Npmkxmbn684H/KygYlHIuae5&#10;pHaJwzoghSRoD4nRLNyVxqTZGMvqnE/H5PI3C90wNmpUmnLn5px6kvBoVMQY+1VpVhapgqhI/FI3&#10;xrODIGYIKZXFVHzyS+iI0pTEWy52+HNWb7nc1tFHBouny1VpwafqL9Iuvvcp6xZPjXxVdxSx2TZU&#10;eM6v+sluoTjSwD20uxCcvCtpKGsR8FF4Ij8NkhYaH+jQBqj50Emc7cD//Js+4omTZOWspmXKefix&#10;F15xZr5YYutoOhwmhmD6pQg+CdPZZBaJs+3Vdl/dAA1kRK+Gk0mMYDS9qD1Uz7TyqxiQTMJKCpvz&#10;bS/eYLvd9GRItVolEK2aE7i2Gyej6zifyLan5ll411ESic330G+cmF8ws8XGmxZWewRdJtrGFrcN&#10;7VpPa5rY3D0p8R14/Z9Q54dv+QsAAP//AwBQSwMEFAAGAAgAAAAhAMNNUIDbAAAABgEAAA8AAABk&#10;cnMvZG93bnJldi54bWxMj8FOwzAQRO9I/QdrkXqjdloFUIhTVZE4VOqFAuLqxNskIl4b22nD3+Ny&#10;gctIo1nNvC23sxnZGX0YLEnIVgIYUmv1QJ2Et9fnu0dgISrSarSEEr4xwLZa3JSq0PZCL3g+xo6l&#10;EgqFktDH6ArOQ9ujUWFlHVLKTtYbFZP1HddeXVK5GflaiHtu1EBpoVcO6x7bz+NkJGA9NZv3+iQm&#10;n39kzu0PLnwdpFzezrsnYBHn+HcMV/yEDlViauxEOrBRQnok/uo1y/J18o2E/GEjgFcl/49f/QAA&#10;AP//AwBQSwECLQAUAAYACAAAACEAtoM4kv4AAADhAQAAEwAAAAAAAAAAAAAAAAAAAAAAW0NvbnRl&#10;bnRfVHlwZXNdLnhtbFBLAQItABQABgAIAAAAIQA4/SH/1gAAAJQBAAALAAAAAAAAAAAAAAAAAC8B&#10;AABfcmVscy8ucmVsc1BLAQItABQABgAIAAAAIQD6sExWbQIAAEAFAAAOAAAAAAAAAAAAAAAAAC4C&#10;AABkcnMvZTJvRG9jLnhtbFBLAQItABQABgAIAAAAIQDDTVCA2wAAAAYBAAAPAAAAAAAAAAAAAAAA&#10;AMcEAABkcnMvZG93bnJldi54bWxQSwUGAAAAAAQABADzAAAAzwUAAAAA&#10;" filled="f" stroked="f" strokeweight=".5pt">
+                  <v:shape w14:anchorId="3964BC16" id="Text Box 163" o:spid="_x0000_s1029" type="#_x0000_t202" style="position:absolute;margin-left:0;margin-top:0;width:8in;height:286.5pt;z-index:251658240;visibility:visible;mso-wrap-style:square;mso-width-percent:941;mso-height-percent:363;mso-top-percent:300;mso-wrap-distance-left:9pt;mso-wrap-distance-top:0;mso-wrap-distance-right:9pt;mso-wrap-distance-bottom:0;mso-position-horizontal:center;mso-position-horizontal-relative:page;mso-position-vertical-relative:page;mso-width-percent:941;mso-height-percent:363;mso-top-percent:300;mso-width-relative:page;mso-height-relative:page;v-text-anchor:bottom" o:gfxdata="UEsDBBQABgAIAAAAIQC2gziS/gAAAOEBAAATAAAAW0NvbnRlbnRfVHlwZXNdLnhtbJSRQU7DMBBF&#10;90jcwfIWJU67QAgl6YK0S0CoHGBkTxKLZGx5TGhvj5O2G0SRWNoz/78nu9wcxkFMGNg6quQqL6RA&#10;0s5Y6ir5vt9lD1JwBDIwOMJKHpHlpr69KfdHjyxSmriSfYz+USnWPY7AufNIadK6MEJMx9ApD/oD&#10;OlTrorhX2lFEilmcO2RdNtjC5xDF9pCuTyYBB5bi6bQ4syoJ3g9WQ0ymaiLzg5KdCXlKLjvcW893&#10;SUOqXwnz5DrgnHtJTxOsQfEKIT7DmDSUCaxw7Rqn8787ZsmRM9e2VmPeBN4uqYvTtW7jvijg9N/y&#10;JsXecLq0q+WD6m8AAAD//wMAUEsDBBQABgAIAAAAIQA4/SH/1gAAAJQBAAALAAAAX3JlbHMvLnJl&#10;bHOkkMFqwzAMhu+DvYPRfXGawxijTi+j0GvpHsDYimMaW0Yy2fr2M4PBMnrbUb/Q94l/f/hMi1qR&#10;JVI2sOt6UJgd+ZiDgffL8ekFlFSbvV0oo4EbChzGx4f9GRdb25HMsYhqlCwG5lrLq9biZkxWOiqY&#10;22YiTra2kYMu1l1tQD30/bPm3wwYN0x18gb45AdQl1tp5j/sFB2T0FQ7R0nTNEV3j6o9feQzro1i&#10;OWA14Fm+Q8a1a8+Bvu/d/dMb2JY5uiPbhG/ktn4cqGU/er3pcvwCAAD//wMAUEsDBBQABgAIAAAA&#10;IQCQ9CzFbgIAAEAFAAAOAAAAZHJzL2Uyb0RvYy54bWysVE1v2zAMvQ/YfxB0X5w0SBYYdYqsRYYB&#10;RVssHXpWZKkxJouaxMTOfv0o2U66bpcOu8g0SfHj8VGXV21t2EH5UIEt+GQ05kxZCWVlnwv+7XH9&#10;YcFZQGFLYcCqgh9V4FfL9+8uG5erC9iBKZVnFMSGvHEF3yG6PMuC3KlahBE4ZcmowdcC6dc/Z6UX&#10;DUWvTXYxHs+zBnzpPEgVAmlvOiNfpvhaK4n3WgeFzBScasN0+nRu45ktL0X+7IXbVbIvQ/xDFbWo&#10;LCU9hboRKNjeV3+EqivpIYDGkYQ6A60rqVIP1M1k/KqbzU44lXohcII7wRT+X1h5d9i4B8+w/QQt&#10;DTAC0riQB1LGflrt6/ilShnZCcLjCTbVIpOk/DidzGgWnEmyTefTxWyWgM3O150P+FlBzaJQcE9z&#10;SXCJw21ASkmug0vMZmFdGZNmYyxrCj6fUsjfLHTD2KhRacp9mHPpScKjUdHH2K9Ks6pMHURF4pe6&#10;Np4dBDFDSKkspuZTXPKOXpqKeMvF3v9c1Vsud30MmcHi6XJdWfCp+1dll9+HknXnT0C+6DuK2G5b&#10;apzmMkx2C+WRBu6h24Xg5LqiodyKgA/CE/lpkLTQeE+HNkDgQy9xtgP/82/66E+cJCtnDS1TwcOP&#10;vfCKM/PFElsn8/E4MQTTL2XwSZgvZotInO2gtvv6GmggE3o1nExidEYziNpD/UQrv4oJySSspLQF&#10;3w7iNXbbTU+GVKtVcqJVcwJv7cbJGDrOJ7LtsX0S3vWURGLzHQwbJ/JXzOx8400Lqz2CrhJtI8Qd&#10;oD30tKaJzf2TEt+Bl//J6/zwLX8BAAD//wMAUEsDBBQABgAIAAAAIQDDTVCA2wAAAAYBAAAPAAAA&#10;ZHJzL2Rvd25yZXYueG1sTI/BTsMwEETvSP0Ha5F6o3ZaBVCIU1WROFTqhQLi6sTbJCJeG9tpw9/j&#10;coHLSKNZzbwtt7MZ2Rl9GCxJyFYCGFJr9UCdhLfX57tHYCEq0mq0hBK+McC2WtyUqtD2Qi94PsaO&#10;pRIKhZLQx+gKzkPbo1FhZR1Syk7WGxWT9R3XXl1SuRn5Woh7btRAaaFXDuse28/jZCRgPTWb9/ok&#10;Jp9/ZM7tDy58HaRc3s67J2AR5/h3DFf8hA5VYmrsRDqwUUJ6JP7qNcvydfKNhPxhI4BXJf+PX/0A&#10;AAD//wMAUEsBAi0AFAAGAAgAAAAhALaDOJL+AAAA4QEAABMAAAAAAAAAAAAAAAAAAAAAAFtDb250&#10;ZW50X1R5cGVzXS54bWxQSwECLQAUAAYACAAAACEAOP0h/9YAAACUAQAACwAAAAAAAAAAAAAAAAAv&#10;AQAAX3JlbHMvLnJlbHNQSwECLQAUAAYACAAAACEAkPQsxW4CAABABQAADgAAAAAAAAAAAAAAAAAu&#10;AgAAZHJzL2Uyb0RvYy54bWxQSwECLQAUAAYACAAAACEAw01QgNsAAAAGAQAADwAAAAAAAAAAAAAA&#10;AADIBAAAZHJzL2Rvd25yZXYueG1sUEsFBgAAAAAEAAQA8wAAANAFAAAAAA==&#10;" filled="f" stroked="f" strokeweight=".5pt">
                     <v:textbox inset="126pt,0,54pt,0">
                       <w:txbxContent>
                         <w:p>
@@ -1005,7 +1238,7 @@
               </mc:Choice>
               <mc:Fallback>
                 <w:pict>
-                  <v:shape w14:anchorId="569CC129" id="_x0000_s1029" type="#_x0000_t202" style="position:absolute;margin-left:18.2pt;margin-top:667.4pt;width:8in;height:1in;z-index:251665408;visibility:visible;mso-wrap-style:square;mso-width-percent:941;mso-height-percent:92;mso-wrap-distance-left:9pt;mso-wrap-distance-top:0;mso-wrap-distance-right:9pt;mso-wrap-distance-bottom:0;mso-position-horizontal:absolute;mso-position-horizontal-relative:page;mso-position-vertical:absolute;mso-position-vertical-relative:page;mso-width-percent:941;mso-height-percent:92;mso-width-relative:page;mso-height-relative:page;v-text-anchor:bottom" o:gfxdata="UEsDBBQABgAIAAAAIQC2gziS/gAAAOEBAAATAAAAW0NvbnRlbnRfVHlwZXNdLnhtbJSRQU7DMBBF&#10;90jcwfIWJU67QAgl6YK0S0CoHGBkTxKLZGx5TGhvj5O2G0SRWNoz/78nu9wcxkFMGNg6quQqL6RA&#10;0s5Y6ir5vt9lD1JwBDIwOMJKHpHlpr69KfdHjyxSmriSfYz+USnWPY7AufNIadK6MEJMx9ApD/oD&#10;OlTrorhX2lFEilmcO2RdNtjC5xDF9pCuTyYBB5bi6bQ4syoJ3g9WQ0ymaiLzg5KdCXlKLjvcW893&#10;SUOqXwnz5DrgnHtJTxOsQfEKIT7DmDSUCaxw7Rqn8787ZsmRM9e2VmPeBN4uqYvTtW7jvijg9N/y&#10;JsXecLq0q+WD6m8AAAD//wMAUEsDBBQABgAIAAAAIQA4/SH/1gAAAJQBAAALAAAAX3JlbHMvLnJl&#10;bHOkkMFqwzAMhu+DvYPRfXGawxijTi+j0GvpHsDYimMaW0Yy2fr2M4PBMnrbUb/Q94l/f/hMi1qR&#10;JVI2sOt6UJgd+ZiDgffL8ekFlFSbvV0oo4EbChzGx4f9GRdb25HMsYhqlCwG5lrLq9biZkxWOiqY&#10;22YiTra2kYMu1l1tQD30/bPm3wwYN0x18gb45AdQl1tp5j/sFB2T0FQ7R0nTNEV3j6o9feQzro1i&#10;OWA14Fm+Q8a1a8+Bvu/d/dMb2JY5uiPbhG/ktn4cqGU/er3pcvwCAAD//wMAUEsDBBQABgAIAAAA&#10;IQBr554WbQIAAD8FAAAOAAAAZHJzL2Uyb0RvYy54bWysVEtv2zAMvg/YfxB0X+z0kWVBnSJrkWFA&#10;0RZLh54VWWqMyaImMbGzXz9KtpMi26XDLjItfnx/1NV1Wxu2Uz5UYAs+HuWcKSuhrOxLwb8/LT9M&#10;OQsobCkMWFXwvQr8ev7+3VXjZuoMNmBK5Rk5sWHWuIJvEN0sy4LcqFqEEThlSanB1wLp179kpRcN&#10;ea9Ndpbnk6wBXzoPUoVAt7edks+Tf62VxAetg0JmCk65YTp9OtfxzOZXYvbihdtUsk9D/EMWtags&#10;BT24uhUo2NZXf7iqK+khgMaRhDoDrSupUg1UzTg/qWa1EU6lWqg5wR3aFP6fW3m/W7lHz7D9DC0N&#10;MDakcWEW6DLW02pfxy9lykhPLdwf2qZaZJIuP56PL2kWnEnSfRpfXJBMbrKjtfMBvyioWRQK7mks&#10;qVtidxewgw6QGMzCsjImjcZY1hR8cn6ZJ4ODhpwbG7EqDbl3c8w8Sbg3KmKM/aY0q8pUQLxI9FI3&#10;xrOdIGIIKZXFVHvyS+iI0pTEWwx7/DGrtxh3dQyRweLBuK4s+FT9SdrljyFl3eGp56/qjiK265YK&#10;L/j5MNg1lHuat4duFYKTy4qGcicCPgpP3Kc50j7jAx3aADUfeomzDfhff7uPeKIkaTlraJcKHn5u&#10;hVecma+WyDqe5HkiCKZfiuCTMJleTiNv1sO13dY3QAMZ06PhZBIjGM0gag/1M238IgYklbCSwhZ8&#10;PYg32C03vRhSLRYJRJvmBN7ZlZPRdZxPZNtT+yy86ymJROZ7GBZOzE6Y2WGjpYXFFkFXibaxxV1D&#10;+9bTlibi9y9KfAZe/yfU8d2b/wYAAP//AwBQSwMEFAAGAAgAAAAhAN0LWL/jAAAADQEAAA8AAABk&#10;cnMvZG93bnJldi54bWxMj0FLw0AQhe+C/2EZwYvYTUxMl5hNkWIRhB5SC8XbJrsmwexsyG7b9N87&#10;Pelt5s3jzfeK1WwHdjKT7x1KiBcRMION0z22Evafm0cBzAeFWg0OjYSL8bAqb28KlWt3xsqcdqFl&#10;FII+VxK6EMacc990xiq/cKNBun27yapA69RyPakzhduBP0VRxq3qkT50ajTrzjQ/u6OV8PF8uGRV&#10;uo432+GteuD+8NXX71Le382vL8CCmcOfGa74hA4lMdXuiNqzQUKSpeQkPUlS6nB1xEKQVtOULoUA&#10;Xhb8f4vyFwAA//8DAFBLAQItABQABgAIAAAAIQC2gziS/gAAAOEBAAATAAAAAAAAAAAAAAAAAAAA&#10;AABbQ29udGVudF9UeXBlc10ueG1sUEsBAi0AFAAGAAgAAAAhADj9If/WAAAAlAEAAAsAAAAAAAAA&#10;AAAAAAAALwEAAF9yZWxzLy5yZWxzUEsBAi0AFAAGAAgAAAAhAGvnnhZtAgAAPwUAAA4AAAAAAAAA&#10;AAAAAAAALgIAAGRycy9lMm9Eb2MueG1sUEsBAi0AFAAGAAgAAAAhAN0LWL/jAAAADQEAAA8AAAAA&#10;AAAAAAAAAAAAxwQAAGRycy9kb3ducmV2LnhtbFBLBQYAAAAABAAEAPMAAADXBQAAAAA=&#10;" filled="f" stroked="f" strokeweight=".5pt">
+                  <v:shape w14:anchorId="569CC129" id="_x0000_s1030" type="#_x0000_t202" style="position:absolute;margin-left:18.2pt;margin-top:667.4pt;width:8in;height:1in;z-index:251665408;visibility:visible;mso-wrap-style:square;mso-width-percent:941;mso-height-percent:92;mso-wrap-distance-left:9pt;mso-wrap-distance-top:0;mso-wrap-distance-right:9pt;mso-wrap-distance-bottom:0;mso-position-horizontal:absolute;mso-position-horizontal-relative:page;mso-position-vertical:absolute;mso-position-vertical-relative:page;mso-width-percent:941;mso-height-percent:92;mso-width-relative:page;mso-height-relative:page;v-text-anchor:bottom" o:gfxdata="UEsDBBQABgAIAAAAIQC2gziS/gAAAOEBAAATAAAAW0NvbnRlbnRfVHlwZXNdLnhtbJSRQU7DMBBF&#10;90jcwfIWJU67QAgl6YK0S0CoHGBkTxKLZGx5TGhvj5O2G0SRWNoz/78nu9wcxkFMGNg6quQqL6RA&#10;0s5Y6ir5vt9lD1JwBDIwOMJKHpHlpr69KfdHjyxSmriSfYz+USnWPY7AufNIadK6MEJMx9ApD/oD&#10;OlTrorhX2lFEilmcO2RdNtjC5xDF9pCuTyYBB5bi6bQ4syoJ3g9WQ0ymaiLzg5KdCXlKLjvcW893&#10;SUOqXwnz5DrgnHtJTxOsQfEKIT7DmDSUCaxw7Rqn8787ZsmRM9e2VmPeBN4uqYvTtW7jvijg9N/y&#10;JsXecLq0q+WD6m8AAAD//wMAUEsDBBQABgAIAAAAIQA4/SH/1gAAAJQBAAALAAAAX3JlbHMvLnJl&#10;bHOkkMFqwzAMhu+DvYPRfXGawxijTi+j0GvpHsDYimMaW0Yy2fr2M4PBMnrbUb/Q94l/f/hMi1qR&#10;JVI2sOt6UJgd+ZiDgffL8ekFlFSbvV0oo4EbChzGx4f9GRdb25HMsYhqlCwG5lrLq9biZkxWOiqY&#10;22YiTra2kYMu1l1tQD30/bPm3wwYN0x18gb45AdQl1tp5j/sFB2T0FQ7R0nTNEV3j6o9feQzro1i&#10;OWA14Fm+Q8a1a8+Bvu/d/dMb2JY5uiPbhG/ktn4cqGU/er3pcvwCAAD//wMAUEsDBBQABgAIAAAA&#10;IQD/Nl1YbQIAAD8FAAAOAAAAZHJzL2Uyb0RvYy54bWysVN9v0zAQfkfif7D8zpJuaynV0qlsGkKq&#10;tokO7dl17DXC8Rn72qT89ZydpJ0KL0O8OBffd7+/89V1Wxu2Uz5UYAs+Oss5U1ZCWdmXgn9/uvsw&#10;5SygsKUwYFXB9yrw6/n7d1eNm6lz2IAplWfkxIZZ4wq+QXSzLAtyo2oRzsApS0oNvhZIv/4lK71o&#10;yHttsvM8n2QN+NJ5kCoEur3tlHye/GutJD5oHRQyU3DKDdPp07mOZza/ErMXL9ymkn0a4h+yqEVl&#10;KejB1a1Awba++sNVXUkPATSeSagz0LqSKtVA1Yzyk2pWG+FUqoWaE9yhTeH/uZX3u5V79Azbz9DS&#10;AGNDGhdmgS5jPa32dfxSpoz01ML9oW2qRSbp8uPFaEyz4EyS7tPo8pJkcpMdrZ0P+EVBzaJQcE9j&#10;Sd0Su2XADjpAYjALd5UxaTTGsqbgk4txngwOGnJubMSqNOTezTHzJOHeqIgx9pvSrCpTAfEi0Uvd&#10;GM92goghpFQWU+3JL6EjSlMSbzHs8ces3mLc1TFEBosH47qy4FP1J2mXP4aUdYennr+qO4rYrlsq&#10;vOCXw2DXUO5p3h66VQhO3lU0lKUI+Cg8cZ/mSPuMD3RoA9R86CXONuB//e0+4omSpOWsoV0qePi5&#10;FV5xZr5aIutokueJIJh+KYJPwmQ6nkberIdru61vgAYyokfDySRGMJpB1B7qZ9r4RQxIKmElhS34&#10;ehBvsFtuejGkWiwSiDbNCVzalZPRdZxPZNtT+yy86ymJROZ7GBZOzE6Y2WGjpYXFFkFXibaxxV1D&#10;+9bTlibi9y9KfAZe/yfU8d2b/wYAAP//AwBQSwMEFAAGAAgAAAAhAN0LWL/jAAAADQEAAA8AAABk&#10;cnMvZG93bnJldi54bWxMj0FLw0AQhe+C/2EZwYvYTUxMl5hNkWIRhB5SC8XbJrsmwexsyG7b9N87&#10;Pelt5s3jzfeK1WwHdjKT7x1KiBcRMION0z22Evafm0cBzAeFWg0OjYSL8bAqb28KlWt3xsqcdqFl&#10;FII+VxK6EMacc990xiq/cKNBun27yapA69RyPakzhduBP0VRxq3qkT50ajTrzjQ/u6OV8PF8uGRV&#10;uo432+GteuD+8NXX71Le382vL8CCmcOfGa74hA4lMdXuiNqzQUKSpeQkPUlS6nB1xEKQVtOULoUA&#10;Xhb8f4vyFwAA//8DAFBLAQItABQABgAIAAAAIQC2gziS/gAAAOEBAAATAAAAAAAAAAAAAAAAAAAA&#10;AABbQ29udGVudF9UeXBlc10ueG1sUEsBAi0AFAAGAAgAAAAhADj9If/WAAAAlAEAAAsAAAAAAAAA&#10;AAAAAAAALwEAAF9yZWxzLy5yZWxzUEsBAi0AFAAGAAgAAAAhAP82XVhtAgAAPwUAAA4AAAAAAAAA&#10;AAAAAAAALgIAAGRycy9lMm9Eb2MueG1sUEsBAi0AFAAGAAgAAAAhAN0LWL/jAAAADQEAAA8AAAAA&#10;AAAAAAAAAAAAxwQAAGRycy9kb3ducmV2LnhtbFBLBQYAAAAABAAEAPMAAADXBQAAAAA=&#10;" filled="f" stroked="f" strokeweight=".5pt">
                     <v:textbox inset="126pt,0,54pt,0">
                       <w:txbxContent>
                         <w:p>
@@ -1577,7 +1810,7 @@
                 <w:noProof/>
                 <w:webHidden/>
               </w:rPr>
-              <w:t>7</w:t>
+              <w:t>8</w:t>
             </w:r>
             <w:r>
               <w:rPr>
@@ -1647,7 +1880,7 @@
                 <w:noProof/>
                 <w:webHidden/>
               </w:rPr>
-              <w:t>7</w:t>
+              <w:t>8</w:t>
             </w:r>
             <w:r>
               <w:rPr>
@@ -1923,7 +2156,7 @@
                 <w:noProof/>
                 <w:webHidden/>
               </w:rPr>
-              <w:t>9</w:t>
+              <w:t>10</w:t>
             </w:r>
             <w:r>
               <w:rPr>
@@ -1991,7 +2224,7 @@
                 <w:noProof/>
                 <w:webHidden/>
               </w:rPr>
-              <w:t>10</w:t>
+              <w:t>11</w:t>
             </w:r>
             <w:r>
               <w:rPr>
@@ -2059,7 +2292,7 @@
                 <w:noProof/>
                 <w:webHidden/>
               </w:rPr>
-              <w:t>10</w:t>
+              <w:t>11</w:t>
             </w:r>
             <w:r>
               <w:rPr>
@@ -2127,7 +2360,7 @@
                 <w:noProof/>
                 <w:webHidden/>
               </w:rPr>
-              <w:t>11</w:t>
+              <w:t>12</w:t>
             </w:r>
             <w:r>
               <w:rPr>
@@ -2577,6 +2810,69 @@
       <w:pPr>
         <w:pStyle w:val="NoSpacing"/>
         <w:rPr>
+          <w:lang w:val="en-PK"/>
+        </w:rPr>
+      </w:pPr>
+    </w:p>
+    <w:p>
+      <w:pPr>
+        <w:pStyle w:val="NoSpacing"/>
+        <w:rPr>
+          <w:lang w:val="en-PK"/>
+        </w:rPr>
+      </w:pPr>
+      <w:proofErr w:type="spellStart"/>
+      <w:r>
+        <w:rPr>
+          <w:rStyle w:val="Heading2Char"/>
+        </w:rPr>
+        <w:t>Github</w:t>
+      </w:r>
+      <w:proofErr w:type="spellEnd"/>
+      <w:r>
+        <w:rPr>
+          <w:rStyle w:val="Heading2Char"/>
+        </w:rPr>
+        <w:t xml:space="preserve"> Repo</w:t>
+      </w:r>
+      <w:r>
+        <w:rPr>
+          <w:b/>
+          <w:bCs/>
+          <w:lang w:val="en-PK"/>
+        </w:rPr>
+        <w:br/>
+      </w:r>
+      <w:hyperlink r:id="rId7" w:history="1">
+        <w:r>
+          <w:rPr>
+            <w:rStyle w:val="Hyperlink"/>
+            <w:lang w:val="en-PK"/>
+          </w:rPr>
+          <w:t xml:space="preserve">Data </w:t>
+        </w:r>
+        <w:proofErr w:type="spellStart"/>
+        <w:r>
+          <w:rPr>
+            <w:rStyle w:val="Hyperlink"/>
+            <w:lang w:val="en-PK"/>
+          </w:rPr>
+          <w:t>Mosiac</w:t>
+        </w:r>
+        <w:proofErr w:type="spellEnd"/>
+        <w:r>
+          <w:rPr>
+            <w:rStyle w:val="Hyperlink"/>
+            <w:lang w:val="en-PK"/>
+          </w:rPr>
+          <w:t xml:space="preserve"> Data Engineering Group 6</w:t>
+        </w:r>
+      </w:hyperlink>
+    </w:p>
+    <w:p>
+      <w:pPr>
+        <w:pStyle w:val="NoSpacing"/>
+        <w:rPr>
           <w:rFonts w:eastAsiaTheme="majorEastAsia"/>
         </w:rPr>
       </w:pPr>
@@ -2815,7 +3111,25 @@
           <w:szCs w:val="22"/>
           <w:lang w:val="en-PK"/>
         </w:rPr>
-        <w:t>Reddit posts discussing particular coins, public opinion).</w:t>
+        <w:t xml:space="preserve">Reddit posts discussing </w:t>
+      </w:r>
+      <w:proofErr w:type="gramStart"/>
+      <w:r>
+        <w:rPr>
+          <w:sz w:val="22"/>
+          <w:szCs w:val="22"/>
+          <w:lang w:val="en-PK"/>
+        </w:rPr>
+        <w:t>particular coins</w:t>
+      </w:r>
+      <w:proofErr w:type="gramEnd"/>
+      <w:r>
+        <w:rPr>
+          <w:sz w:val="22"/>
+          <w:szCs w:val="22"/>
+          <w:lang w:val="en-PK"/>
+        </w:rPr>
+        <w:t>, public opinion).</w:t>
       </w:r>
     </w:p>
     <w:p>
@@ -3153,7 +3467,7 @@
           <w:lang w:val="en-PK"/>
         </w:rPr>
       </w:pPr>
-      <w:hyperlink r:id="rId7" w:tgtFrame="_new" w:history="1">
+      <w:hyperlink r:id="rId8" w:tgtFrame="_new" w:history="1">
         <w:r>
           <w:rPr>
             <w:rStyle w:val="Hyperlink"/>
@@ -3179,7 +3493,7 @@
           <w:lang w:val="en-PK"/>
         </w:rPr>
       </w:pPr>
-      <w:hyperlink r:id="rId8" w:tgtFrame="_new" w:history="1">
+      <w:hyperlink r:id="rId9" w:tgtFrame="_new" w:history="1">
         <w:r>
           <w:rPr>
             <w:rStyle w:val="Hyperlink"/>
@@ -3723,6 +4037,7 @@
         <w:t>: Google often blocked large requests, so we spaced out requests with a 3-minute sleep (</w:t>
       </w:r>
       <w:proofErr w:type="spellStart"/>
+      <w:proofErr w:type="gramStart"/>
       <w:r>
         <w:rPr>
           <w:lang w:val="en-PK"/>
@@ -3730,6 +4045,7 @@
         <w:t>time.sleep</w:t>
       </w:r>
       <w:proofErr w:type="spellEnd"/>
+      <w:proofErr w:type="gramEnd"/>
       <w:r>
         <w:rPr>
           <w:lang w:val="en-PK"/>
@@ -4049,7 +4365,7 @@
                     <pic:cNvPicPr/>
                   </pic:nvPicPr>
                   <pic:blipFill>
-                    <a:blip r:embed="rId9">
+                    <a:blip r:embed="rId10">
                       <a:extLst>
                         <a:ext uri="{28A0092B-C50C-407E-A947-70E740481C1C}">
                           <a14:useLocalDpi xmlns:a14="http://schemas.microsoft.com/office/drawing/2010/main" val="0"/>
@@ -4273,7 +4589,7 @@
                     <pic:cNvPicPr/>
                   </pic:nvPicPr>
                   <pic:blipFill>
-                    <a:blip r:embed="rId10">
+                    <a:blip r:embed="rId11">
                       <a:extLst>
                         <a:ext uri="{28A0092B-C50C-407E-A947-70E740481C1C}">
                           <a14:useLocalDpi xmlns:a14="http://schemas.microsoft.com/office/drawing/2010/main" val="0"/>
@@ -4434,7 +4750,7 @@
                     <pic:cNvPicPr/>
                   </pic:nvPicPr>
                   <pic:blipFill>
-                    <a:blip r:embed="rId11" cstate="print">
+                    <a:blip r:embed="rId12" cstate="print">
                       <a:extLst>
                         <a:ext uri="{28A0092B-C50C-407E-A947-70E740481C1C}">
                           <a14:useLocalDpi xmlns:a14="http://schemas.microsoft.com/office/drawing/2010/main" val="0"/>
@@ -4682,7 +4998,7 @@
                     <pic:cNvPicPr/>
                   </pic:nvPicPr>
                   <pic:blipFill>
-                    <a:blip r:embed="rId12"/>
+                    <a:blip r:embed="rId13"/>
                     <a:stretch>
                       <a:fillRect/>
                     </a:stretch>
@@ -5564,7 +5880,21 @@
               <w:rPr>
                 <w:lang w:val="en-PK"/>
               </w:rPr>
-              <w:t>Potential for partial or incomplete data if time-limited.</w:t>
+              <w:t xml:space="preserve">Potential for partial or incomplete data if </w:t>
+            </w:r>
+            <w:proofErr w:type="gramStart"/>
+            <w:r>
+              <w:rPr>
+                <w:lang w:val="en-PK"/>
+              </w:rPr>
+              <w:t>time-limited</w:t>
+            </w:r>
+            <w:proofErr w:type="gramEnd"/>
+            <w:r>
+              <w:rPr>
+                <w:lang w:val="en-PK"/>
+              </w:rPr>
+              <w:t>.</w:t>
             </w:r>
           </w:p>
         </w:tc>
@@ -5877,7 +6207,7 @@
                     <pic:cNvPicPr/>
                   </pic:nvPicPr>
                   <pic:blipFill>
-                    <a:blip r:embed="rId13"/>
+                    <a:blip r:embed="rId14"/>
                     <a:stretch>
                       <a:fillRect/>
                     </a:stretch>
@@ -5944,7 +6274,7 @@
                     <pic:cNvPicPr/>
                   </pic:nvPicPr>
                   <pic:blipFill>
-                    <a:blip r:embed="rId14"/>
+                    <a:blip r:embed="rId15"/>
                     <a:stretch>
                       <a:fillRect/>
                     </a:stretch>
@@ -6001,7 +6331,7 @@
                     <pic:cNvPicPr/>
                   </pic:nvPicPr>
                   <pic:blipFill>
-                    <a:blip r:embed="rId15"/>
+                    <a:blip r:embed="rId16"/>
                     <a:stretch>
                       <a:fillRect/>
                     </a:stretch>
@@ -6044,7 +6374,23 @@
           <w:sz w:val="22"/>
           <w:szCs w:val="22"/>
         </w:rPr>
-        <w:t>A snapshot showing each ticker’s mean, minimum, and maximum prices over the queried timeframe.</w:t>
+        <w:t xml:space="preserve">A snapshot showing each ticker’s </w:t>
+      </w:r>
+      <w:proofErr w:type="gramStart"/>
+      <w:r>
+        <w:rPr>
+          <w:sz w:val="22"/>
+          <w:szCs w:val="22"/>
+        </w:rPr>
+        <w:t>mean</w:t>
+      </w:r>
+      <w:proofErr w:type="gramEnd"/>
+      <w:r>
+        <w:rPr>
+          <w:sz w:val="22"/>
+          <w:szCs w:val="22"/>
+        </w:rPr>
+        <w:t>, minimum, and maximum prices over the queried timeframe.</w:t>
       </w:r>
     </w:p>
     <w:p>
@@ -6068,7 +6414,7 @@
                     <pic:cNvPicPr/>
                   </pic:nvPicPr>
                   <pic:blipFill>
-                    <a:blip r:embed="rId16"/>
+                    <a:blip r:embed="rId17"/>
                     <a:stretch>
                       <a:fillRect/>
                     </a:stretch>
@@ -6134,7 +6480,7 @@
                     <pic:cNvPicPr/>
                   </pic:nvPicPr>
                   <pic:blipFill>
-                    <a:blip r:embed="rId17"/>
+                    <a:blip r:embed="rId18"/>
                     <a:stretch>
                       <a:fillRect/>
                     </a:stretch>
@@ -6202,7 +6548,7 @@
                     <pic:cNvPicPr/>
                   </pic:nvPicPr>
                   <pic:blipFill>
-                    <a:blip r:embed="rId18"/>
+                    <a:blip r:embed="rId19"/>
                     <a:stretch>
                       <a:fillRect/>
                     </a:stretch>

</xml_diff>